<commit_message>
Store daily recap Word us_market_recap_2026-10-31_BJT_us_2026-10-30_final
</commit_message>
<xml_diff>
--- a/reports/us_market_recap_2026-10-31_BJT_us_2026-10-30_final.docx
+++ b/reports/us_market_recap_2026-10-31_BJT_us_2026-10-30_final.docx
@@ -30,7 +30,7 @@
         <w:rPr>
           <w:highlight w:val="yellow"/>
         </w:rPr>
-        <w:t xml:space="preserve">结论先行：指数表现为道指 -1.09%、标普500 -1.82%、纳指 -2.86%、Russell 2000 -1.66%；S&amp;P 500 广度为上涨 349、下跌 154，涨跌比 2.27。板块当日相对强弱由 </w:t>
+        <w:t xml:space="preserve">结论先行：指数表现为道指 -1.09%、标普500 -1.82%、纳指 -2.86%、Russell 2000 -1.66%；S&amp;P 500 广度为上涨 228、下跌 274，涨跌比 0.83。板块当日相对强弱由 </w:t>
       </w:r>
       <w:r>
         <w:rPr>
@@ -1013,7 +1013,7 @@
                 <w:color w:val="141414"/>
                 <w:sz w:val="16"/>
               </w:rPr>
-              <w:t>101.96 / 102.95 / 7.73万美元</w:t>
+              <w:t>101.88 / 104.12 / 7.73万美元</w:t>
             </w:r>
           </w:p>
         </w:tc>
@@ -1040,7 +1040,7 @@
                 <w:color w:val="141414"/>
                 <w:sz w:val="16"/>
               </w:rPr>
-              <w:t>DXY -0.07% / WTI +0.93% / BTC -0.67%</w:t>
+              <w:t>DXY -0.16% / WTI +2.08% / BTC -0.67%</w:t>
             </w:r>
           </w:p>
         </w:tc>
@@ -1216,7 +1216,7 @@
         <w:t>SOXX</w:t>
       </w:r>
       <w:r>
-        <w:t xml:space="preserve">（半导体）-8.24%；上涨占比 69.4%。需要把 </w:t>
+        <w:t xml:space="preserve">（半导体）-8.24%；上涨占比 45.3%。需要把 </w:t>
       </w:r>
       <w:r>
         <w:t>ETF</w:t>
@@ -1548,19 +1548,7 @@
         <w:t>RDDT</w:t>
       </w:r>
       <w:r>
-        <w:t>（S&amp;P 500成分股（行业标签待核））-40.93%、</w:t>
-      </w:r>
-      <w:r>
-        <w:t>FFIV</w:t>
-      </w:r>
-      <w:r>
-        <w:t>（网络设备/应用交付）-28.96%、</w:t>
-      </w:r>
-      <w:r>
-        <w:t>FTNT</w:t>
-      </w:r>
-      <w:r>
-        <w:t>（S&amp;P 500成分股（行业标签待核））-28.66%、</w:t>
+        <w:t>（S&amp;P 500成分股（行业标签待核））-29.32%、</w:t>
       </w:r>
       <w:r>
         <w:rPr>
@@ -1572,28 +1560,40 @@
         <w:t>（单股异动（行业标签待核））-28.58%、</w:t>
       </w:r>
       <w:r>
-        <w:t>ROP</w:t>
+        <w:t>ILMN</w:t>
       </w:r>
       <w:r>
-        <w:t>（S&amp;P 500成分股（行业标签待核））+26.65%、</w:t>
+        <w:t>（S&amp;P 500成分股（行业标签待核））-18.58%、</w:t>
       </w:r>
       <w:r>
-        <w:t>LMT</w:t>
+        <w:t>TWLO</w:t>
       </w:r>
       <w:r>
-        <w:t>（航空航天/国防）+26.37%、</w:t>
+        <w:t>（S&amp;P 500成分股（行业标签待核））-15.23%、</w:t>
       </w:r>
       <w:r>
-        <w:t>PNR</w:t>
+        <w:t>FDXF</w:t>
       </w:r>
       <w:r>
-        <w:t>（S&amp;P 500成分股（行业标签待核））+25.09%、</w:t>
+        <w:t>（S&amp;P 500成分股（行业标签待核））+14.71%、</w:t>
       </w:r>
       <w:r>
-        <w:t>HAS</w:t>
+        <w:t>REGN</w:t>
       </w:r>
       <w:r>
-        <w:t>（可选消费/玩具）+24.13%、</w:t>
+        <w:t>（S&amp;P 500成分股（行业标签待核））+13.49%、</w:t>
+      </w:r>
+      <w:r>
+        <w:t>GPN</w:t>
+      </w:r>
+      <w:r>
+        <w:t>（S&amp;P 500成分股（行业标签待核））+13.01%、</w:t>
+      </w:r>
+      <w:r>
+        <w:t>GDDY</w:t>
+      </w:r>
+      <w:r>
+        <w:t>（S&amp;P 500成分股（行业标签待核））+10.62%、</w:t>
       </w:r>
       <w:r>
         <w:rPr>
@@ -3197,7 +3197,7 @@
         <w:t>AI</w:t>
       </w:r>
       <w:r>
-        <w:t xml:space="preserve"> Applications 1D -2.55pp / 5D +7.63pp / 20D -7.69pp（CONFIRMED）；High Beta - Low Vol 1D -4.67pp / 5D +1.12pp / 20D -16.03pp（CONFIRMED）；Small Cap - Large Cap 1D +0.13pp / 5D +1.86pp / 20D +1.03pp（UNCLEAR）。上涨占比 69.4%，因此需把指数方向、横截面参与度和 1D/5D/20D 持续性分开判断；不能用单日价差直接替代资金流。</w:t>
+        <w:t xml:space="preserve"> Applications 1D -2.55pp / 5D +7.63pp / 20D -7.69pp（CONFIRMED）；High Beta - Low Vol 1D -4.67pp / 5D +1.12pp / 20D -16.03pp（CONFIRMED）；Small Cap - Large Cap 1D +0.13pp / 5D +1.86pp / 20D +1.03pp（UNCLEAR）。上涨占比 45.3%，因此需把指数方向、横截面参与度和 1D/5D/20D 持续性分开判断；不能用单日价差直接替代资金流。</w:t>
       </w:r>
     </w:p>
     <w:p>
@@ -3267,7 +3267,7 @@
         <w:spacing w:after="120" w:line="276" w:lineRule="auto"/>
       </w:pPr>
       <w:r>
-        <w:t>广度：上涨 349、下跌 154、不变 0，上涨占比 69.4%，涨跌比 2.27；252日新高 70、新低 14。这不是“全市场风险关闭”，而是指数权重和主题结构在切换。</w:t>
+        <w:t>广度：上涨 228、下跌 274、不变 1，上涨占比 45.3%，涨跌比 0.83；252日新高 41、新低 5。这不是“全市场风险关闭”，而是指数权重和主题结构在切换。</w:t>
       </w:r>
       <w:r>
         <w:rPr>
@@ -3827,229 +3827,7 @@
                 <w:color w:val="141414"/>
                 <w:sz w:val="16"/>
               </w:rPr>
-              <w:t>S&amp;P 500成分股（行业标签待核）；价格 -40.93%；相对SPY -39.16pp；成交不可得</w:t>
-            </w:r>
-          </w:p>
-        </w:tc>
-        <w:tc>
-          <w:tcPr>
-            <w:tcW w:type="dxa" w:w="1440"/>
-            <w:vAlign w:val="center"/>
-            <w:shd w:fill="FFFFFF"/>
-            <w:tcMar>
-              <w:top w:w="90" w:type="dxa"/>
-              <w:start w:w="90" w:type="dxa"/>
-              <w:bottom w:w="90" w:type="dxa"/>
-              <w:end w:w="90" w:type="dxa"/>
-            </w:tcMar>
-          </w:tcPr>
-          <w:p>
-            <w:pPr>
-              <w:spacing w:before="60" w:after="60" w:line="240" w:lineRule="auto"/>
-              <w:jc w:val="center"/>
-            </w:pPr>
-            <w:r>
-              <w:rPr>
-                <w:b w:val="0"/>
-                <w:color w:val="141414"/>
-                <w:sz w:val="16"/>
-              </w:rPr>
-              <w:t>top_decliner</w:t>
-            </w:r>
-          </w:p>
-        </w:tc>
-        <w:tc>
-          <w:tcPr>
-            <w:tcW w:type="dxa" w:w="2880"/>
-            <w:vAlign w:val="center"/>
-            <w:shd w:fill="FFFFFF"/>
-            <w:tcMar>
-              <w:top w:w="90" w:type="dxa"/>
-              <w:start w:w="90" w:type="dxa"/>
-              <w:bottom w:w="90" w:type="dxa"/>
-              <w:end w:w="90" w:type="dxa"/>
-            </w:tcMar>
-          </w:tcPr>
-          <w:p>
-            <w:pPr>
-              <w:spacing w:before="60" w:after="60" w:line="240" w:lineRule="auto"/>
-            </w:pPr>
-            <w:r>
-              <w:rPr>
-                <w:b w:val="0"/>
-                <w:color w:val="141414"/>
-                <w:sz w:val="16"/>
-              </w:rPr>
-              <w:t>待核验同日增量；先归为公司/行业/因子重定价候选，不把涨跌倒推成原因</w:t>
-            </w:r>
-          </w:p>
-        </w:tc>
-      </w:tr>
-      <w:tr>
-        <w:trPr>
-          <w:cantSplit/>
-        </w:trPr>
-        <w:tc>
-          <w:tcPr>
-            <w:tcW w:type="dxa" w:w="2088"/>
-            <w:vAlign w:val="center"/>
-            <w:shd w:fill="FFFFFF"/>
-            <w:tcMar>
-              <w:top w:w="90" w:type="dxa"/>
-              <w:start w:w="90" w:type="dxa"/>
-              <w:bottom w:w="90" w:type="dxa"/>
-              <w:end w:w="90" w:type="dxa"/>
-            </w:tcMar>
-          </w:tcPr>
-          <w:p>
-            <w:pPr>
-              <w:spacing w:before="60" w:after="60" w:line="240" w:lineRule="auto"/>
-              <w:jc w:val="center"/>
-            </w:pPr>
-            <w:r>
-              <w:rPr>
-                <w:b w:val="0"/>
-                <w:color w:val="141414"/>
-                <w:sz w:val="16"/>
-              </w:rPr>
-              <w:t>FFIV</w:t>
-            </w:r>
-          </w:p>
-        </w:tc>
-        <w:tc>
-          <w:tcPr>
-            <w:tcW w:type="dxa" w:w="2952"/>
-            <w:vAlign w:val="center"/>
-            <w:shd w:fill="FFFFFF"/>
-            <w:tcMar>
-              <w:top w:w="90" w:type="dxa"/>
-              <w:start w:w="90" w:type="dxa"/>
-              <w:bottom w:w="90" w:type="dxa"/>
-              <w:end w:w="90" w:type="dxa"/>
-            </w:tcMar>
-          </w:tcPr>
-          <w:p>
-            <w:pPr>
-              <w:spacing w:before="60" w:after="60" w:line="240" w:lineRule="auto"/>
-            </w:pPr>
-            <w:r>
-              <w:rPr>
-                <w:b w:val="0"/>
-                <w:color w:val="141414"/>
-                <w:sz w:val="16"/>
-              </w:rPr>
-              <w:t>网络设备/应用交付；价格 -28.96%；相对SPY -27.18pp；成交不可得</w:t>
-            </w:r>
-          </w:p>
-        </w:tc>
-        <w:tc>
-          <w:tcPr>
-            <w:tcW w:type="dxa" w:w="1440"/>
-            <w:vAlign w:val="center"/>
-            <w:shd w:fill="FFFFFF"/>
-            <w:tcMar>
-              <w:top w:w="90" w:type="dxa"/>
-              <w:start w:w="90" w:type="dxa"/>
-              <w:bottom w:w="90" w:type="dxa"/>
-              <w:end w:w="90" w:type="dxa"/>
-            </w:tcMar>
-          </w:tcPr>
-          <w:p>
-            <w:pPr>
-              <w:spacing w:before="60" w:after="60" w:line="240" w:lineRule="auto"/>
-              <w:jc w:val="center"/>
-            </w:pPr>
-            <w:r>
-              <w:rPr>
-                <w:b w:val="0"/>
-                <w:color w:val="141414"/>
-                <w:sz w:val="16"/>
-              </w:rPr>
-              <w:t>top_decliner</w:t>
-            </w:r>
-          </w:p>
-        </w:tc>
-        <w:tc>
-          <w:tcPr>
-            <w:tcW w:type="dxa" w:w="2880"/>
-            <w:vAlign w:val="center"/>
-            <w:shd w:fill="FFFFFF"/>
-            <w:tcMar>
-              <w:top w:w="90" w:type="dxa"/>
-              <w:start w:w="90" w:type="dxa"/>
-              <w:bottom w:w="90" w:type="dxa"/>
-              <w:end w:w="90" w:type="dxa"/>
-            </w:tcMar>
-          </w:tcPr>
-          <w:p>
-            <w:pPr>
-              <w:spacing w:before="60" w:after="60" w:line="240" w:lineRule="auto"/>
-            </w:pPr>
-            <w:r>
-              <w:rPr>
-                <w:b w:val="0"/>
-                <w:color w:val="141414"/>
-                <w:sz w:val="16"/>
-              </w:rPr>
-              <w:t>待核验同日增量；先归为公司/行业/因子重定价候选，不把涨跌倒推成原因</w:t>
-            </w:r>
-          </w:p>
-        </w:tc>
-      </w:tr>
-      <w:tr>
-        <w:trPr>
-          <w:cantSplit/>
-        </w:trPr>
-        <w:tc>
-          <w:tcPr>
-            <w:tcW w:type="dxa" w:w="2088"/>
-            <w:vAlign w:val="center"/>
-            <w:shd w:fill="FFFFFF"/>
-            <w:tcMar>
-              <w:top w:w="90" w:type="dxa"/>
-              <w:start w:w="90" w:type="dxa"/>
-              <w:bottom w:w="90" w:type="dxa"/>
-              <w:end w:w="90" w:type="dxa"/>
-            </w:tcMar>
-          </w:tcPr>
-          <w:p>
-            <w:pPr>
-              <w:spacing w:before="60" w:after="60" w:line="240" w:lineRule="auto"/>
-              <w:jc w:val="center"/>
-            </w:pPr>
-            <w:r>
-              <w:rPr>
-                <w:b w:val="0"/>
-                <w:color w:val="141414"/>
-                <w:sz w:val="16"/>
-              </w:rPr>
-              <w:t>FTNT</w:t>
-            </w:r>
-          </w:p>
-        </w:tc>
-        <w:tc>
-          <w:tcPr>
-            <w:tcW w:type="dxa" w:w="2952"/>
-            <w:vAlign w:val="center"/>
-            <w:shd w:fill="FFFFFF"/>
-            <w:tcMar>
-              <w:top w:w="90" w:type="dxa"/>
-              <w:start w:w="90" w:type="dxa"/>
-              <w:bottom w:w="90" w:type="dxa"/>
-              <w:end w:w="90" w:type="dxa"/>
-            </w:tcMar>
-          </w:tcPr>
-          <w:p>
-            <w:pPr>
-              <w:spacing w:before="60" w:after="60" w:line="240" w:lineRule="auto"/>
-            </w:pPr>
-            <w:r>
-              <w:rPr>
-                <w:b w:val="0"/>
-                <w:color w:val="141414"/>
-                <w:sz w:val="16"/>
-              </w:rPr>
-              <w:t>S&amp;P 500成分股（行业标签待核）；价格 -28.66%；相对SPY -26.89pp；成交不可得</w:t>
+              <w:t>S&amp;P 500成分股（行业标签待核）；价格 -29.32%；相对SPY -27.55pp；成交不可得</w:t>
             </w:r>
           </w:p>
         </w:tc>
@@ -4160,7 +3938,7 @@
                 <w:color w:val="141414"/>
                 <w:sz w:val="16"/>
               </w:rPr>
-              <w:t>单股异动（行业标签待核）；价格 -28.58%；相对SPY -26.80pp；成交 11.64x均量</w:t>
+              <w:t>单股异动（行业标签待核）；价格 -28.58%；相对SPY -26.80pp；成交 4.33x均量</w:t>
             </w:r>
           </w:p>
         </w:tc>
@@ -4245,7 +4023,7 @@
                 <w:color w:val="141414"/>
                 <w:sz w:val="16"/>
               </w:rPr>
-              <w:t>ROP</w:t>
+              <w:t>ILMN</w:t>
             </w:r>
           </w:p>
         </w:tc>
@@ -4271,7 +4049,229 @@
                 <w:color w:val="141414"/>
                 <w:sz w:val="16"/>
               </w:rPr>
-              <w:t>S&amp;P 500成分股（行业标签待核）；价格 +26.65%；相对SPY +28.43pp；成交不可得</w:t>
+              <w:t>S&amp;P 500成分股（行业标签待核）；价格 -18.58%；相对SPY -16.81pp；成交不可得</w:t>
+            </w:r>
+          </w:p>
+        </w:tc>
+        <w:tc>
+          <w:tcPr>
+            <w:tcW w:type="dxa" w:w="1440"/>
+            <w:vAlign w:val="center"/>
+            <w:shd w:fill="FFFFFF"/>
+            <w:tcMar>
+              <w:top w:w="90" w:type="dxa"/>
+              <w:start w:w="90" w:type="dxa"/>
+              <w:bottom w:w="90" w:type="dxa"/>
+              <w:end w:w="90" w:type="dxa"/>
+            </w:tcMar>
+          </w:tcPr>
+          <w:p>
+            <w:pPr>
+              <w:spacing w:before="60" w:after="60" w:line="240" w:lineRule="auto"/>
+              <w:jc w:val="center"/>
+            </w:pPr>
+            <w:r>
+              <w:rPr>
+                <w:b w:val="0"/>
+                <w:color w:val="141414"/>
+                <w:sz w:val="16"/>
+              </w:rPr>
+              <w:t>top_decliner</w:t>
+            </w:r>
+          </w:p>
+        </w:tc>
+        <w:tc>
+          <w:tcPr>
+            <w:tcW w:type="dxa" w:w="2880"/>
+            <w:vAlign w:val="center"/>
+            <w:shd w:fill="FFFFFF"/>
+            <w:tcMar>
+              <w:top w:w="90" w:type="dxa"/>
+              <w:start w:w="90" w:type="dxa"/>
+              <w:bottom w:w="90" w:type="dxa"/>
+              <w:end w:w="90" w:type="dxa"/>
+            </w:tcMar>
+          </w:tcPr>
+          <w:p>
+            <w:pPr>
+              <w:spacing w:before="60" w:after="60" w:line="240" w:lineRule="auto"/>
+            </w:pPr>
+            <w:r>
+              <w:rPr>
+                <w:b w:val="0"/>
+                <w:color w:val="141414"/>
+                <w:sz w:val="16"/>
+              </w:rPr>
+              <w:t>待核验同日增量；先归为公司/行业/因子重定价候选，不把涨跌倒推成原因</w:t>
+            </w:r>
+          </w:p>
+        </w:tc>
+      </w:tr>
+      <w:tr>
+        <w:trPr>
+          <w:cantSplit/>
+        </w:trPr>
+        <w:tc>
+          <w:tcPr>
+            <w:tcW w:type="dxa" w:w="2088"/>
+            <w:vAlign w:val="center"/>
+            <w:shd w:fill="FFFFFF"/>
+            <w:tcMar>
+              <w:top w:w="90" w:type="dxa"/>
+              <w:start w:w="90" w:type="dxa"/>
+              <w:bottom w:w="90" w:type="dxa"/>
+              <w:end w:w="90" w:type="dxa"/>
+            </w:tcMar>
+          </w:tcPr>
+          <w:p>
+            <w:pPr>
+              <w:spacing w:before="60" w:after="60" w:line="240" w:lineRule="auto"/>
+              <w:jc w:val="center"/>
+            </w:pPr>
+            <w:r>
+              <w:rPr>
+                <w:b w:val="0"/>
+                <w:color w:val="141414"/>
+                <w:sz w:val="16"/>
+              </w:rPr>
+              <w:t>TWLO</w:t>
+            </w:r>
+          </w:p>
+        </w:tc>
+        <w:tc>
+          <w:tcPr>
+            <w:tcW w:type="dxa" w:w="2952"/>
+            <w:vAlign w:val="center"/>
+            <w:shd w:fill="FFFFFF"/>
+            <w:tcMar>
+              <w:top w:w="90" w:type="dxa"/>
+              <w:start w:w="90" w:type="dxa"/>
+              <w:bottom w:w="90" w:type="dxa"/>
+              <w:end w:w="90" w:type="dxa"/>
+            </w:tcMar>
+          </w:tcPr>
+          <w:p>
+            <w:pPr>
+              <w:spacing w:before="60" w:after="60" w:line="240" w:lineRule="auto"/>
+            </w:pPr>
+            <w:r>
+              <w:rPr>
+                <w:b w:val="0"/>
+                <w:color w:val="141414"/>
+                <w:sz w:val="16"/>
+              </w:rPr>
+              <w:t>S&amp;P 500成分股（行业标签待核）；价格 -15.23%；相对SPY -13.46pp；成交不可得</w:t>
+            </w:r>
+          </w:p>
+        </w:tc>
+        <w:tc>
+          <w:tcPr>
+            <w:tcW w:type="dxa" w:w="1440"/>
+            <w:vAlign w:val="center"/>
+            <w:shd w:fill="FFFFFF"/>
+            <w:tcMar>
+              <w:top w:w="90" w:type="dxa"/>
+              <w:start w:w="90" w:type="dxa"/>
+              <w:bottom w:w="90" w:type="dxa"/>
+              <w:end w:w="90" w:type="dxa"/>
+            </w:tcMar>
+          </w:tcPr>
+          <w:p>
+            <w:pPr>
+              <w:spacing w:before="60" w:after="60" w:line="240" w:lineRule="auto"/>
+              <w:jc w:val="center"/>
+            </w:pPr>
+            <w:r>
+              <w:rPr>
+                <w:b w:val="0"/>
+                <w:color w:val="141414"/>
+                <w:sz w:val="16"/>
+              </w:rPr>
+              <w:t>top_decliner</w:t>
+            </w:r>
+          </w:p>
+        </w:tc>
+        <w:tc>
+          <w:tcPr>
+            <w:tcW w:type="dxa" w:w="2880"/>
+            <w:vAlign w:val="center"/>
+            <w:shd w:fill="FFFFFF"/>
+            <w:tcMar>
+              <w:top w:w="90" w:type="dxa"/>
+              <w:start w:w="90" w:type="dxa"/>
+              <w:bottom w:w="90" w:type="dxa"/>
+              <w:end w:w="90" w:type="dxa"/>
+            </w:tcMar>
+          </w:tcPr>
+          <w:p>
+            <w:pPr>
+              <w:spacing w:before="60" w:after="60" w:line="240" w:lineRule="auto"/>
+            </w:pPr>
+            <w:r>
+              <w:rPr>
+                <w:b w:val="0"/>
+                <w:color w:val="141414"/>
+                <w:sz w:val="16"/>
+              </w:rPr>
+              <w:t>待核验同日增量；先归为公司/行业/因子重定价候选，不把涨跌倒推成原因</w:t>
+            </w:r>
+          </w:p>
+        </w:tc>
+      </w:tr>
+      <w:tr>
+        <w:trPr>
+          <w:cantSplit/>
+        </w:trPr>
+        <w:tc>
+          <w:tcPr>
+            <w:tcW w:type="dxa" w:w="2088"/>
+            <w:vAlign w:val="center"/>
+            <w:shd w:fill="FFFFFF"/>
+            <w:tcMar>
+              <w:top w:w="90" w:type="dxa"/>
+              <w:start w:w="90" w:type="dxa"/>
+              <w:bottom w:w="90" w:type="dxa"/>
+              <w:end w:w="90" w:type="dxa"/>
+            </w:tcMar>
+          </w:tcPr>
+          <w:p>
+            <w:pPr>
+              <w:spacing w:before="60" w:after="60" w:line="240" w:lineRule="auto"/>
+              <w:jc w:val="center"/>
+            </w:pPr>
+            <w:r>
+              <w:rPr>
+                <w:b w:val="0"/>
+                <w:color w:val="141414"/>
+                <w:sz w:val="16"/>
+              </w:rPr>
+              <w:t>FDXF</w:t>
+            </w:r>
+          </w:p>
+        </w:tc>
+        <w:tc>
+          <w:tcPr>
+            <w:tcW w:type="dxa" w:w="2952"/>
+            <w:vAlign w:val="center"/>
+            <w:shd w:fill="FFFFFF"/>
+            <w:tcMar>
+              <w:top w:w="90" w:type="dxa"/>
+              <w:start w:w="90" w:type="dxa"/>
+              <w:bottom w:w="90" w:type="dxa"/>
+              <w:end w:w="90" w:type="dxa"/>
+            </w:tcMar>
+          </w:tcPr>
+          <w:p>
+            <w:pPr>
+              <w:spacing w:before="60" w:after="60" w:line="240" w:lineRule="auto"/>
+            </w:pPr>
+            <w:r>
+              <w:rPr>
+                <w:b w:val="0"/>
+                <w:color w:val="141414"/>
+                <w:sz w:val="16"/>
+              </w:rPr>
+              <w:t>S&amp;P 500成分股（行业标签待核）；价格 +14.71%；相对SPY +16.48pp；成交不可得</w:t>
             </w:r>
           </w:p>
         </w:tc>
@@ -4356,7 +4356,7 @@
                 <w:color w:val="141414"/>
                 <w:sz w:val="16"/>
               </w:rPr>
-              <w:t>LMT</w:t>
+              <w:t>REGN</w:t>
             </w:r>
           </w:p>
         </w:tc>
@@ -4382,7 +4382,7 @@
                 <w:color w:val="141414"/>
                 <w:sz w:val="16"/>
               </w:rPr>
-              <w:t>航空航天/国防；价格 +26.37%；相对SPY +28.15pp；成交不可得</w:t>
+              <w:t>S&amp;P 500成分股（行业标签待核）；价格 +13.49%；相对SPY +15.26pp；成交不可得</w:t>
             </w:r>
           </w:p>
         </w:tc>
@@ -4678,7 +4678,7 @@
       <w:r>
         <w:drawing>
           <wp:inline xmlns:a="http://schemas.openxmlformats.org/drawingml/2006/main" xmlns:pic="http://schemas.openxmlformats.org/drawingml/2006/picture">
-            <wp:extent cx="5806440" cy="2968460"/>
+            <wp:extent cx="5806440" cy="2965129"/>
             <wp:docPr id="16" name="Picture 16"/>
             <wp:cNvGraphicFramePr>
               <a:graphicFrameLocks noChangeAspect="1"/>
@@ -4699,7 +4699,7 @@
                   <pic:spPr>
                     <a:xfrm>
                       <a:off x="0" y="0"/>
-                      <a:ext cx="5806440" cy="2968460"/>
+                      <a:ext cx="5806440" cy="2965129"/>
                     </a:xfrm>
                     <a:prstGeom prst="rect"/>
                   </pic:spPr>
@@ -4893,19 +4893,7 @@
         <w:t>RDDT</w:t>
       </w:r>
       <w:r>
-        <w:t xml:space="preserve"> -40.93%（S&amp;P 500成分股（行业标签待核））；</w:t>
-      </w:r>
-      <w:r>
-        <w:t>FFIV</w:t>
-      </w:r>
-      <w:r>
-        <w:t xml:space="preserve"> -28.96%（网络设备/应用交付）；</w:t>
-      </w:r>
-      <w:r>
-        <w:t>FTNT</w:t>
-      </w:r>
-      <w:r>
-        <w:t xml:space="preserve"> -28.66%（S&amp;P 500成分股（行业标签待核））；</w:t>
+        <w:t xml:space="preserve"> -29.32%（S&amp;P 500成分股（行业标签待核））；</w:t>
       </w:r>
       <w:r>
         <w:rPr>
@@ -4914,31 +4902,43 @@
         <w:t>INTC</w:t>
       </w:r>
       <w:r>
-        <w:t xml:space="preserve"> -28.58%（单股异动（行业标签待核）；成交约11.64x均量）；</w:t>
+        <w:t xml:space="preserve"> -28.58%（单股异动（行业标签待核）；成交约4.33x均量）；</w:t>
       </w:r>
       <w:r>
-        <w:t>ROP</w:t>
+        <w:t>ILMN</w:t>
       </w:r>
       <w:r>
-        <w:t xml:space="preserve"> +26.65%（S&amp;P 500成分股（行业标签待核））；</w:t>
+        <w:t xml:space="preserve"> -18.58%（S&amp;P 500成分股（行业标签待核））；</w:t>
       </w:r>
       <w:r>
-        <w:t>LMT</w:t>
+        <w:t>TWLO</w:t>
       </w:r>
       <w:r>
-        <w:t xml:space="preserve"> +26.37%（航空航天/国防）；</w:t>
+        <w:t xml:space="preserve"> -15.23%（S&amp;P 500成分股（行业标签待核））；</w:t>
       </w:r>
       <w:r>
-        <w:t>PNR</w:t>
+        <w:t>FDXF</w:t>
       </w:r>
       <w:r>
-        <w:t xml:space="preserve"> +25.09%（S&amp;P 500成分股（行业标签待核））；</w:t>
+        <w:t xml:space="preserve"> +14.71%（S&amp;P 500成分股（行业标签待核））；</w:t>
       </w:r>
       <w:r>
-        <w:t>HAS</w:t>
+        <w:t>REGN</w:t>
       </w:r>
       <w:r>
-        <w:t xml:space="preserve"> +24.13%（可选消费/玩具）；</w:t>
+        <w:t xml:space="preserve"> +13.49%（S&amp;P 500成分股（行业标签待核））；</w:t>
+      </w:r>
+      <w:r>
+        <w:t>GPN</w:t>
+      </w:r>
+      <w:r>
+        <w:t xml:space="preserve"> +13.01%（S&amp;P 500成分股（行业标签待核））；</w:t>
+      </w:r>
+      <w:r>
+        <w:t>GDDY</w:t>
+      </w:r>
+      <w:r>
+        <w:t xml:space="preserve"> +10.62%（S&amp;P 500成分股（行业标签待核））；</w:t>
       </w:r>
       <w:r>
         <w:rPr>
@@ -4947,7 +4947,7 @@
         <w:t>AMZN</w:t>
       </w:r>
       <w:r>
-        <w:t xml:space="preserve"> -1.41%（单股异动（行业标签待核）；成交约12.34x均量）。这些名字先记录为价格/成交异常，随后核对同日公告、研报、公司交流、行业数据或传闻原始出处；没有证据时保留“待验”，不把涨跌倒推成原因。</w:t>
+        <w:t xml:space="preserve"> -1.41%（单股异动（行业标签待核）；成交约2.73x均量）。这些名字先记录为价格/成交异常，随后核对同日公告、研报、公司交流、行业数据或传闻原始出处；没有证据时保留“待验”，不把涨跌倒推成原因。</w:t>
       </w:r>
     </w:p>
     <w:p>
@@ -6018,7 +6018,7 @@
       <w:r>
         <w:drawing>
           <wp:inline xmlns:a="http://schemas.openxmlformats.org/drawingml/2006/main" xmlns:pic="http://schemas.openxmlformats.org/drawingml/2006/picture">
-            <wp:extent cx="5806440" cy="2779401"/>
+            <wp:extent cx="5806440" cy="2777842"/>
             <wp:docPr id="24" name="Picture 24"/>
             <wp:cNvGraphicFramePr>
               <a:graphicFrameLocks noChangeAspect="1"/>
@@ -6039,7 +6039,7 @@
                   <pic:spPr>
                     <a:xfrm>
                       <a:off x="0" y="0"/>
-                      <a:ext cx="5806440" cy="2779401"/>
+                      <a:ext cx="5806440" cy="2777842"/>
                     </a:xfrm>
                     <a:prstGeom prst="rect"/>
                   </pic:spPr>
@@ -6240,7 +6240,7 @@
                 <w:color w:val="141414"/>
                 <w:sz w:val="16"/>
               </w:rPr>
-              <w:t>S&amp;P 500成分股（行业标签待核） -40.93%</w:t>
+              <w:t>S&amp;P 500成分股（行业标签待核） -29.32%</w:t>
             </w:r>
           </w:p>
         </w:tc>
@@ -6266,229 +6266,7 @@
                 <w:color w:val="141414"/>
                 <w:sz w:val="16"/>
               </w:rPr>
-              <w:t>成交不可得；相对SPY -39.16pp</w:t>
-            </w:r>
-          </w:p>
-        </w:tc>
-        <w:tc>
-          <w:tcPr>
-            <w:tcW w:type="dxa" w:w="4320"/>
-            <w:vAlign w:val="center"/>
-            <w:shd w:fill="FFFFFF"/>
-            <w:tcMar>
-              <w:top w:w="90" w:type="dxa"/>
-              <w:start w:w="90" w:type="dxa"/>
-              <w:bottom w:w="90" w:type="dxa"/>
-              <w:end w:w="90" w:type="dxa"/>
-            </w:tcMar>
-          </w:tcPr>
-          <w:p>
-            <w:pPr>
-              <w:spacing w:before="60" w:after="60" w:line="240" w:lineRule="auto"/>
-            </w:pPr>
-            <w:r>
-              <w:rPr>
-                <w:b w:val="0"/>
-                <w:color w:val="141414"/>
-                <w:sz w:val="16"/>
-              </w:rPr>
-              <w:t>当日价格/成交异常；需用同日公告、研报、交流或产业数据确认原因</w:t>
-            </w:r>
-          </w:p>
-        </w:tc>
-      </w:tr>
-      <w:tr>
-        <w:trPr>
-          <w:cantSplit/>
-        </w:trPr>
-        <w:tc>
-          <w:tcPr>
-            <w:tcW w:type="dxa" w:w="1440"/>
-            <w:vAlign w:val="center"/>
-            <w:shd w:fill="FFFFFF"/>
-            <w:tcMar>
-              <w:top w:w="90" w:type="dxa"/>
-              <w:start w:w="90" w:type="dxa"/>
-              <w:bottom w:w="90" w:type="dxa"/>
-              <w:end w:w="90" w:type="dxa"/>
-            </w:tcMar>
-          </w:tcPr>
-          <w:p>
-            <w:pPr>
-              <w:spacing w:before="60" w:after="60" w:line="240" w:lineRule="auto"/>
-              <w:jc w:val="center"/>
-            </w:pPr>
-            <w:r>
-              <w:rPr>
-                <w:b w:val="0"/>
-                <w:color w:val="141414"/>
-                <w:sz w:val="16"/>
-              </w:rPr>
-              <w:t>FFIV</w:t>
-            </w:r>
-          </w:p>
-        </w:tc>
-        <w:tc>
-          <w:tcPr>
-            <w:tcW w:type="dxa" w:w="1440"/>
-            <w:vAlign w:val="center"/>
-            <w:shd w:fill="FFFFFF"/>
-            <w:tcMar>
-              <w:top w:w="90" w:type="dxa"/>
-              <w:start w:w="90" w:type="dxa"/>
-              <w:bottom w:w="90" w:type="dxa"/>
-              <w:end w:w="90" w:type="dxa"/>
-            </w:tcMar>
-          </w:tcPr>
-          <w:p>
-            <w:pPr>
-              <w:spacing w:before="60" w:after="60" w:line="240" w:lineRule="auto"/>
-              <w:jc w:val="center"/>
-            </w:pPr>
-            <w:r>
-              <w:rPr>
-                <w:b w:val="0"/>
-                <w:color w:val="141414"/>
-                <w:sz w:val="16"/>
-              </w:rPr>
-              <w:t>网络设备/应用交付 -28.96%</w:t>
-            </w:r>
-          </w:p>
-        </w:tc>
-        <w:tc>
-          <w:tcPr>
-            <w:tcW w:type="dxa" w:w="1944"/>
-            <w:vAlign w:val="center"/>
-            <w:shd w:fill="FFFFFF"/>
-            <w:tcMar>
-              <w:top w:w="90" w:type="dxa"/>
-              <w:start w:w="90" w:type="dxa"/>
-              <w:bottom w:w="90" w:type="dxa"/>
-              <w:end w:w="90" w:type="dxa"/>
-            </w:tcMar>
-          </w:tcPr>
-          <w:p>
-            <w:pPr>
-              <w:spacing w:before="60" w:after="60" w:line="240" w:lineRule="auto"/>
-            </w:pPr>
-            <w:r>
-              <w:rPr>
-                <w:b w:val="0"/>
-                <w:color w:val="141414"/>
-                <w:sz w:val="16"/>
-              </w:rPr>
-              <w:t>成交不可得；相对SPY -27.18pp</w:t>
-            </w:r>
-          </w:p>
-        </w:tc>
-        <w:tc>
-          <w:tcPr>
-            <w:tcW w:type="dxa" w:w="4320"/>
-            <w:vAlign w:val="center"/>
-            <w:shd w:fill="FFFFFF"/>
-            <w:tcMar>
-              <w:top w:w="90" w:type="dxa"/>
-              <w:start w:w="90" w:type="dxa"/>
-              <w:bottom w:w="90" w:type="dxa"/>
-              <w:end w:w="90" w:type="dxa"/>
-            </w:tcMar>
-          </w:tcPr>
-          <w:p>
-            <w:pPr>
-              <w:spacing w:before="60" w:after="60" w:line="240" w:lineRule="auto"/>
-            </w:pPr>
-            <w:r>
-              <w:rPr>
-                <w:b w:val="0"/>
-                <w:color w:val="141414"/>
-                <w:sz w:val="16"/>
-              </w:rPr>
-              <w:t>当日价格/成交异常；需用同日公告、研报、交流或产业数据确认原因</w:t>
-            </w:r>
-          </w:p>
-        </w:tc>
-      </w:tr>
-      <w:tr>
-        <w:trPr>
-          <w:cantSplit/>
-        </w:trPr>
-        <w:tc>
-          <w:tcPr>
-            <w:tcW w:type="dxa" w:w="1440"/>
-            <w:vAlign w:val="center"/>
-            <w:shd w:fill="FFFFFF"/>
-            <w:tcMar>
-              <w:top w:w="90" w:type="dxa"/>
-              <w:start w:w="90" w:type="dxa"/>
-              <w:bottom w:w="90" w:type="dxa"/>
-              <w:end w:w="90" w:type="dxa"/>
-            </w:tcMar>
-          </w:tcPr>
-          <w:p>
-            <w:pPr>
-              <w:spacing w:before="60" w:after="60" w:line="240" w:lineRule="auto"/>
-              <w:jc w:val="center"/>
-            </w:pPr>
-            <w:r>
-              <w:rPr>
-                <w:b w:val="0"/>
-                <w:color w:val="141414"/>
-                <w:sz w:val="16"/>
-              </w:rPr>
-              <w:t>FTNT</w:t>
-            </w:r>
-          </w:p>
-        </w:tc>
-        <w:tc>
-          <w:tcPr>
-            <w:tcW w:type="dxa" w:w="1440"/>
-            <w:vAlign w:val="center"/>
-            <w:shd w:fill="FFFFFF"/>
-            <w:tcMar>
-              <w:top w:w="90" w:type="dxa"/>
-              <w:start w:w="90" w:type="dxa"/>
-              <w:bottom w:w="90" w:type="dxa"/>
-              <w:end w:w="90" w:type="dxa"/>
-            </w:tcMar>
-          </w:tcPr>
-          <w:p>
-            <w:pPr>
-              <w:spacing w:before="60" w:after="60" w:line="240" w:lineRule="auto"/>
-              <w:jc w:val="center"/>
-            </w:pPr>
-            <w:r>
-              <w:rPr>
-                <w:b w:val="0"/>
-                <w:color w:val="141414"/>
-                <w:sz w:val="16"/>
-              </w:rPr>
-              <w:t>S&amp;P 500成分股（行业标签待核） -28.66%</w:t>
-            </w:r>
-          </w:p>
-        </w:tc>
-        <w:tc>
-          <w:tcPr>
-            <w:tcW w:type="dxa" w:w="1944"/>
-            <w:vAlign w:val="center"/>
-            <w:shd w:fill="FFFFFF"/>
-            <w:tcMar>
-              <w:top w:w="90" w:type="dxa"/>
-              <w:start w:w="90" w:type="dxa"/>
-              <w:bottom w:w="90" w:type="dxa"/>
-              <w:end w:w="90" w:type="dxa"/>
-            </w:tcMar>
-          </w:tcPr>
-          <w:p>
-            <w:pPr>
-              <w:spacing w:before="60" w:after="60" w:line="240" w:lineRule="auto"/>
-            </w:pPr>
-            <w:r>
-              <w:rPr>
-                <w:b w:val="0"/>
-                <w:color w:val="141414"/>
-                <w:sz w:val="16"/>
-              </w:rPr>
-              <w:t>成交不可得；相对SPY -26.89pp</w:t>
+              <w:t>成交不可得；相对SPY -27.55pp</w:t>
             </w:r>
           </w:p>
         </w:tc>
@@ -6599,7 +6377,229 @@
                 <w:color w:val="141414"/>
                 <w:sz w:val="16"/>
               </w:rPr>
-              <w:t>11.64x均量；相对SPY -26.80pp</w:t>
+              <w:t>4.33x均量；相对SPY -26.80pp</w:t>
+            </w:r>
+          </w:p>
+        </w:tc>
+        <w:tc>
+          <w:tcPr>
+            <w:tcW w:type="dxa" w:w="4320"/>
+            <w:vAlign w:val="center"/>
+            <w:shd w:fill="FFFFFF"/>
+            <w:tcMar>
+              <w:top w:w="90" w:type="dxa"/>
+              <w:start w:w="90" w:type="dxa"/>
+              <w:bottom w:w="90" w:type="dxa"/>
+              <w:end w:w="90" w:type="dxa"/>
+            </w:tcMar>
+          </w:tcPr>
+          <w:p>
+            <w:pPr>
+              <w:spacing w:before="60" w:after="60" w:line="240" w:lineRule="auto"/>
+            </w:pPr>
+            <w:r>
+              <w:rPr>
+                <w:b w:val="0"/>
+                <w:color w:val="141414"/>
+                <w:sz w:val="16"/>
+              </w:rPr>
+              <w:t>当日价格/成交异常；需用同日公告、研报、交流或产业数据确认原因</w:t>
+            </w:r>
+          </w:p>
+        </w:tc>
+      </w:tr>
+      <w:tr>
+        <w:trPr>
+          <w:cantSplit/>
+        </w:trPr>
+        <w:tc>
+          <w:tcPr>
+            <w:tcW w:type="dxa" w:w="1440"/>
+            <w:vAlign w:val="center"/>
+            <w:shd w:fill="FFFFFF"/>
+            <w:tcMar>
+              <w:top w:w="90" w:type="dxa"/>
+              <w:start w:w="90" w:type="dxa"/>
+              <w:bottom w:w="90" w:type="dxa"/>
+              <w:end w:w="90" w:type="dxa"/>
+            </w:tcMar>
+          </w:tcPr>
+          <w:p>
+            <w:pPr>
+              <w:spacing w:before="60" w:after="60" w:line="240" w:lineRule="auto"/>
+              <w:jc w:val="center"/>
+            </w:pPr>
+            <w:r>
+              <w:rPr>
+                <w:b w:val="0"/>
+                <w:color w:val="141414"/>
+                <w:sz w:val="16"/>
+              </w:rPr>
+              <w:t>ILMN</w:t>
+            </w:r>
+          </w:p>
+        </w:tc>
+        <w:tc>
+          <w:tcPr>
+            <w:tcW w:type="dxa" w:w="1440"/>
+            <w:vAlign w:val="center"/>
+            <w:shd w:fill="FFFFFF"/>
+            <w:tcMar>
+              <w:top w:w="90" w:type="dxa"/>
+              <w:start w:w="90" w:type="dxa"/>
+              <w:bottom w:w="90" w:type="dxa"/>
+              <w:end w:w="90" w:type="dxa"/>
+            </w:tcMar>
+          </w:tcPr>
+          <w:p>
+            <w:pPr>
+              <w:spacing w:before="60" w:after="60" w:line="240" w:lineRule="auto"/>
+              <w:jc w:val="center"/>
+            </w:pPr>
+            <w:r>
+              <w:rPr>
+                <w:b w:val="0"/>
+                <w:color w:val="141414"/>
+                <w:sz w:val="16"/>
+              </w:rPr>
+              <w:t>S&amp;P 500成分股（行业标签待核） -18.58%</w:t>
+            </w:r>
+          </w:p>
+        </w:tc>
+        <w:tc>
+          <w:tcPr>
+            <w:tcW w:type="dxa" w:w="1944"/>
+            <w:vAlign w:val="center"/>
+            <w:shd w:fill="FFFFFF"/>
+            <w:tcMar>
+              <w:top w:w="90" w:type="dxa"/>
+              <w:start w:w="90" w:type="dxa"/>
+              <w:bottom w:w="90" w:type="dxa"/>
+              <w:end w:w="90" w:type="dxa"/>
+            </w:tcMar>
+          </w:tcPr>
+          <w:p>
+            <w:pPr>
+              <w:spacing w:before="60" w:after="60" w:line="240" w:lineRule="auto"/>
+            </w:pPr>
+            <w:r>
+              <w:rPr>
+                <w:b w:val="0"/>
+                <w:color w:val="141414"/>
+                <w:sz w:val="16"/>
+              </w:rPr>
+              <w:t>成交不可得；相对SPY -16.81pp</w:t>
+            </w:r>
+          </w:p>
+        </w:tc>
+        <w:tc>
+          <w:tcPr>
+            <w:tcW w:type="dxa" w:w="4320"/>
+            <w:vAlign w:val="center"/>
+            <w:shd w:fill="FFFFFF"/>
+            <w:tcMar>
+              <w:top w:w="90" w:type="dxa"/>
+              <w:start w:w="90" w:type="dxa"/>
+              <w:bottom w:w="90" w:type="dxa"/>
+              <w:end w:w="90" w:type="dxa"/>
+            </w:tcMar>
+          </w:tcPr>
+          <w:p>
+            <w:pPr>
+              <w:spacing w:before="60" w:after="60" w:line="240" w:lineRule="auto"/>
+            </w:pPr>
+            <w:r>
+              <w:rPr>
+                <w:b w:val="0"/>
+                <w:color w:val="141414"/>
+                <w:sz w:val="16"/>
+              </w:rPr>
+              <w:t>当日价格/成交异常；需用同日公告、研报、交流或产业数据确认原因</w:t>
+            </w:r>
+          </w:p>
+        </w:tc>
+      </w:tr>
+      <w:tr>
+        <w:trPr>
+          <w:cantSplit/>
+        </w:trPr>
+        <w:tc>
+          <w:tcPr>
+            <w:tcW w:type="dxa" w:w="1440"/>
+            <w:vAlign w:val="center"/>
+            <w:shd w:fill="FFFFFF"/>
+            <w:tcMar>
+              <w:top w:w="90" w:type="dxa"/>
+              <w:start w:w="90" w:type="dxa"/>
+              <w:bottom w:w="90" w:type="dxa"/>
+              <w:end w:w="90" w:type="dxa"/>
+            </w:tcMar>
+          </w:tcPr>
+          <w:p>
+            <w:pPr>
+              <w:spacing w:before="60" w:after="60" w:line="240" w:lineRule="auto"/>
+              <w:jc w:val="center"/>
+            </w:pPr>
+            <w:r>
+              <w:rPr>
+                <w:b w:val="0"/>
+                <w:color w:val="141414"/>
+                <w:sz w:val="16"/>
+              </w:rPr>
+              <w:t>TWLO</w:t>
+            </w:r>
+          </w:p>
+        </w:tc>
+        <w:tc>
+          <w:tcPr>
+            <w:tcW w:type="dxa" w:w="1440"/>
+            <w:vAlign w:val="center"/>
+            <w:shd w:fill="FFFFFF"/>
+            <w:tcMar>
+              <w:top w:w="90" w:type="dxa"/>
+              <w:start w:w="90" w:type="dxa"/>
+              <w:bottom w:w="90" w:type="dxa"/>
+              <w:end w:w="90" w:type="dxa"/>
+            </w:tcMar>
+          </w:tcPr>
+          <w:p>
+            <w:pPr>
+              <w:spacing w:before="60" w:after="60" w:line="240" w:lineRule="auto"/>
+              <w:jc w:val="center"/>
+            </w:pPr>
+            <w:r>
+              <w:rPr>
+                <w:b w:val="0"/>
+                <w:color w:val="141414"/>
+                <w:sz w:val="16"/>
+              </w:rPr>
+              <w:t>S&amp;P 500成分股（行业标签待核） -15.23%</w:t>
+            </w:r>
+          </w:p>
+        </w:tc>
+        <w:tc>
+          <w:tcPr>
+            <w:tcW w:type="dxa" w:w="1944"/>
+            <w:vAlign w:val="center"/>
+            <w:shd w:fill="FFFFFF"/>
+            <w:tcMar>
+              <w:top w:w="90" w:type="dxa"/>
+              <w:start w:w="90" w:type="dxa"/>
+              <w:bottom w:w="90" w:type="dxa"/>
+              <w:end w:w="90" w:type="dxa"/>
+            </w:tcMar>
+          </w:tcPr>
+          <w:p>
+            <w:pPr>
+              <w:spacing w:before="60" w:after="60" w:line="240" w:lineRule="auto"/>
+            </w:pPr>
+            <w:r>
+              <w:rPr>
+                <w:b w:val="0"/>
+                <w:color w:val="141414"/>
+                <w:sz w:val="16"/>
+              </w:rPr>
+              <w:t>成交不可得；相对SPY -13.46pp</w:t>
             </w:r>
           </w:p>
         </w:tc>
@@ -6710,7 +6710,7 @@
                 <w:color w:val="141414"/>
                 <w:sz w:val="16"/>
               </w:rPr>
-              <w:t>12.34x均量；相对SPY +0.36pp</w:t>
+              <w:t>2.73x均量；相对SPY +0.36pp</w:t>
             </w:r>
           </w:p>
         </w:tc>
@@ -6823,7 +6823,7 @@
         <w:t>SOXX</w:t>
       </w:r>
       <w:r>
-        <w:t>（半导体）-8.24%；S&amp;P 广度上涨占比 69.4%，</w:t>
+        <w:t>（半导体）-8.24%；S&amp;P 广度上涨占比 45.3%，</w:t>
       </w:r>
       <w:r>
         <w:rPr>
@@ -7076,7 +7076,7 @@
                 <w:color w:val="141414"/>
                 <w:sz w:val="16"/>
               </w:rPr>
-              <w:t>2026-11-06</w:t>
+              <w:t>不可得</w:t>
             </w:r>
           </w:p>
         </w:tc>
@@ -7102,7 +7102,7 @@
                 <w:color w:val="141414"/>
                 <w:sz w:val="16"/>
               </w:rPr>
-              <w:t>1.61</w:t>
+              <w:t>nan</w:t>
             </w:r>
           </w:p>
         </w:tc>
@@ -7128,7 +7128,7 @@
                 <w:color w:val="141414"/>
                 <w:sz w:val="16"/>
               </w:rPr>
-              <w:t>11.3%</w:t>
+              <w:t>nan%</w:t>
             </w:r>
           </w:p>
         </w:tc>
@@ -7154,7 +7154,7 @@
                 <w:color w:val="141414"/>
                 <w:sz w:val="16"/>
               </w:rPr>
-              <w:t>无阈值报警</w:t>
+              <w:t>source unavailable</w:t>
             </w:r>
           </w:p>
         </w:tc>
@@ -7212,7 +7212,7 @@
                 <w:color w:val="141414"/>
                 <w:sz w:val="16"/>
               </w:rPr>
-              <w:t>2026-11-06</w:t>
+              <w:t>不可得</w:t>
             </w:r>
           </w:p>
         </w:tc>
@@ -7238,7 +7238,7 @@
                 <w:color w:val="141414"/>
                 <w:sz w:val="16"/>
               </w:rPr>
-              <w:t>1.37</w:t>
+              <w:t>nan</w:t>
             </w:r>
           </w:p>
         </w:tc>
@@ -7264,7 +7264,7 @@
                 <w:color w:val="141414"/>
                 <w:sz w:val="16"/>
               </w:rPr>
-              <w:t>17.7%</w:t>
+              <w:t>nan%</w:t>
             </w:r>
           </w:p>
         </w:tc>
@@ -7290,7 +7290,7 @@
                 <w:color w:val="141414"/>
                 <w:sz w:val="16"/>
               </w:rPr>
-              <w:t>strike-concentration</w:t>
+              <w:t>source unavailable</w:t>
             </w:r>
           </w:p>
         </w:tc>
@@ -7348,7 +7348,7 @@
                 <w:color w:val="141414"/>
                 <w:sz w:val="16"/>
               </w:rPr>
-              <w:t>2026-11-06</w:t>
+              <w:t>不可得</w:t>
             </w:r>
           </w:p>
         </w:tc>
@@ -7374,7 +7374,7 @@
                 <w:color w:val="141414"/>
                 <w:sz w:val="16"/>
               </w:rPr>
-              <w:t>3.55</w:t>
+              <w:t>nan</w:t>
             </w:r>
           </w:p>
         </w:tc>
@@ -7400,7 +7400,7 @@
                 <w:color w:val="141414"/>
                 <w:sz w:val="16"/>
               </w:rPr>
-              <w:t>33.8%</w:t>
+              <w:t>nan%</w:t>
             </w:r>
           </w:p>
         </w:tc>
@@ -7426,7 +7426,7 @@
                 <w:color w:val="141414"/>
                 <w:sz w:val="16"/>
               </w:rPr>
-              <w:t>call-heavy, strike-concentration</w:t>
+              <w:t>source unavailable</w:t>
             </w:r>
           </w:p>
         </w:tc>
@@ -7892,7 +7892,7 @@
                 <w:color w:val="141414"/>
                 <w:sz w:val="16"/>
               </w:rPr>
-              <w:t>2026-11-02</w:t>
+              <w:t>不可得</w:t>
             </w:r>
           </w:p>
         </w:tc>
@@ -7918,7 +7918,7 @@
                 <w:color w:val="141414"/>
                 <w:sz w:val="16"/>
               </w:rPr>
-              <w:t>1.01</w:t>
+              <w:t>nan</w:t>
             </w:r>
           </w:p>
         </w:tc>
@@ -7944,7 +7944,7 @@
                 <w:color w:val="141414"/>
                 <w:sz w:val="16"/>
               </w:rPr>
-              <w:t>14.1%</w:t>
+              <w:t>nan%</w:t>
             </w:r>
           </w:p>
         </w:tc>
@@ -7970,7 +7970,7 @@
                 <w:color w:val="141414"/>
                 <w:sz w:val="16"/>
               </w:rPr>
-              <w:t>call-volume/OI&gt;=2, put-volume/OI&gt;=2</w:t>
+              <w:t>source unavailable</w:t>
             </w:r>
           </w:p>
         </w:tc>
@@ -8164,7 +8164,7 @@
                 <w:color w:val="141414"/>
                 <w:sz w:val="16"/>
               </w:rPr>
-              <w:t>2026-11-02</w:t>
+              <w:t>不可得</w:t>
             </w:r>
           </w:p>
         </w:tc>
@@ -8190,7 +8190,7 @@
                 <w:color w:val="141414"/>
                 <w:sz w:val="16"/>
               </w:rPr>
-              <w:t>1.61</w:t>
+              <w:t>nan</w:t>
             </w:r>
           </w:p>
         </w:tc>
@@ -8216,7 +8216,7 @@
                 <w:color w:val="141414"/>
                 <w:sz w:val="16"/>
               </w:rPr>
-              <w:t>8.3%</w:t>
+              <w:t>nan%</w:t>
             </w:r>
           </w:p>
         </w:tc>
@@ -8242,7 +8242,7 @@
                 <w:color w:val="141414"/>
                 <w:sz w:val="16"/>
               </w:rPr>
-              <w:t>put-volume/OI&gt;=2</w:t>
+              <w:t>source unavailable</w:t>
             </w:r>
           </w:p>
         </w:tc>
@@ -8300,7 +8300,7 @@
                 <w:color w:val="141414"/>
                 <w:sz w:val="16"/>
               </w:rPr>
-              <w:t>2026-11-06</w:t>
+              <w:t>不可得</w:t>
             </w:r>
           </w:p>
         </w:tc>
@@ -8326,7 +8326,7 @@
                 <w:color w:val="141414"/>
                 <w:sz w:val="16"/>
               </w:rPr>
-              <w:t>3.62</w:t>
+              <w:t>nan</w:t>
             </w:r>
           </w:p>
         </w:tc>
@@ -8352,7 +8352,7 @@
                 <w:color w:val="141414"/>
                 <w:sz w:val="16"/>
               </w:rPr>
-              <w:t>28.4%</w:t>
+              <w:t>nan%</w:t>
             </w:r>
           </w:p>
         </w:tc>
@@ -8378,7 +8378,7 @@
                 <w:color w:val="141414"/>
                 <w:sz w:val="16"/>
               </w:rPr>
-              <w:t>call-heavy, put-heavy, strike-concentration</w:t>
+              <w:t>source unavailable</w:t>
             </w:r>
           </w:p>
         </w:tc>
@@ -8572,7 +8572,7 @@
                 <w:color w:val="141414"/>
                 <w:sz w:val="16"/>
               </w:rPr>
-              <w:t>2026-11-20</w:t>
+              <w:t>不可得</w:t>
             </w:r>
           </w:p>
         </w:tc>
@@ -8598,7 +8598,7 @@
                 <w:color w:val="141414"/>
                 <w:sz w:val="16"/>
               </w:rPr>
-              <w:t>2.82</w:t>
+              <w:t>nan</w:t>
             </w:r>
           </w:p>
         </w:tc>
@@ -8624,7 +8624,7 @@
                 <w:color w:val="141414"/>
                 <w:sz w:val="16"/>
               </w:rPr>
-              <w:t>39.8%</w:t>
+              <w:t>nan%</w:t>
             </w:r>
           </w:p>
         </w:tc>
@@ -8650,7 +8650,7 @@
                 <w:color w:val="141414"/>
                 <w:sz w:val="16"/>
               </w:rPr>
-              <w:t>put-heavy, strike-concentration</w:t>
+              <w:t>source unavailable</w:t>
             </w:r>
           </w:p>
         </w:tc>
@@ -8844,7 +8844,7 @@
                 <w:color w:val="141414"/>
                 <w:sz w:val="16"/>
               </w:rPr>
-              <w:t>2026-11-06</w:t>
+              <w:t>不可得</w:t>
             </w:r>
           </w:p>
         </w:tc>
@@ -8870,7 +8870,7 @@
                 <w:color w:val="141414"/>
                 <w:sz w:val="16"/>
               </w:rPr>
-              <w:t>1.26</w:t>
+              <w:t>nan</w:t>
             </w:r>
           </w:p>
         </w:tc>
@@ -8896,7 +8896,7 @@
                 <w:color w:val="141414"/>
                 <w:sz w:val="16"/>
               </w:rPr>
-              <w:t>9.4%</w:t>
+              <w:t>nan%</w:t>
             </w:r>
           </w:p>
         </w:tc>
@@ -8922,7 +8922,7 @@
                 <w:color w:val="141414"/>
                 <w:sz w:val="16"/>
               </w:rPr>
-              <w:t>strike-concentration</w:t>
+              <w:t>source unavailable</w:t>
             </w:r>
           </w:p>
         </w:tc>
@@ -9077,7 +9077,7 @@
       <w:r>
         <w:drawing>
           <wp:inline xmlns:a="http://schemas.openxmlformats.org/drawingml/2006/main" xmlns:pic="http://schemas.openxmlformats.org/drawingml/2006/picture">
-            <wp:extent cx="5806440" cy="3679165"/>
+            <wp:extent cx="5806440" cy="3915895"/>
             <wp:docPr id="25" name="Picture 25"/>
             <wp:cNvGraphicFramePr>
               <a:graphicFrameLocks noChangeAspect="1"/>
@@ -9098,7 +9098,7 @@
                   <pic:spPr>
                     <a:xfrm>
                       <a:off x="0" y="0"/>
-                      <a:ext cx="5806440" cy="3679165"/>
+                      <a:ext cx="5806440" cy="3915895"/>
                     </a:xfrm>
                     <a:prstGeom prst="rect"/>
                   </pic:spPr>
@@ -9119,7 +9119,7 @@
           <w:color w:val="555555"/>
           <w:sz w:val="17"/>
         </w:rPr>
-        <w:t>图：公开期权链异常扫描。来源/口径：Nasdaq public option-chain endpoint；检查时点 2026-10-30T20:36:54-04:00；无执行方向确认。。</w:t>
+        <w:t>图：公开期权链异常扫描。来源/口径：Nasdaq public option-chain endpoint；检查时点 2026-10-31T01:10:55-04:00；无执行方向确认。。</w:t>
       </w:r>
     </w:p>
     <w:p>
@@ -9128,6 +9128,15 @@
       </w:pPr>
       <w:r>
         <w:t xml:space="preserve">解读规则：本次触发异常阈值的标的为 </w:t>
+      </w:r>
+      <w:r>
+        <w:rPr>
+          <w:shd w:fill="E7E6E6"/>
+        </w:rPr>
+        <w:t>LITE</w:t>
+      </w:r>
+      <w:r>
+        <w:t xml:space="preserve">, </w:t>
       </w:r>
       <w:r>
         <w:rPr>
@@ -9260,7 +9269,7 @@
       <w:r>
         <w:drawing>
           <wp:inline xmlns:a="http://schemas.openxmlformats.org/drawingml/2006/main" xmlns:pic="http://schemas.openxmlformats.org/drawingml/2006/picture">
-            <wp:extent cx="5806440" cy="3193704"/>
+            <wp:extent cx="5806440" cy="1989574"/>
             <wp:docPr id="26" name="Picture 26"/>
             <wp:cNvGraphicFramePr>
               <a:graphicFrameLocks noChangeAspect="1"/>
@@ -9281,7 +9290,7 @@
                   <pic:spPr>
                     <a:xfrm>
                       <a:off x="0" y="0"/>
-                      <a:ext cx="5806440" cy="3193704"/>
+                      <a:ext cx="5806440" cy="1989574"/>
                     </a:xfrm>
                     <a:prstGeom prst="rect"/>
                   </pic:spPr>
@@ -9801,7 +9810,7 @@
         <w:spacing w:after="120" w:line="276" w:lineRule="auto"/>
       </w:pPr>
       <w:r>
-        <w:t>今天可确认的是价格与横截面结构：标普 -1.82%、纳指 -2.86%，广度上涨占比 69.4%，</w:t>
+        <w:t>今天可确认的是价格与横截面结构：标普 -1.82%、纳指 -2.86%，广度上涨占比 45.3%，</w:t>
       </w:r>
       <w:r>
         <w:rPr>

</xml_diff>